<commit_message>
arreglos estados de avance
Co-authored-by: Paula Belman <166656129+suricataa@users.noreply.github.com>
Co-authored-by: Alexander Sepúlveda <134305713+Alexander23S@users.noreply.github.com>
</commit_message>
<xml_diff>
--- a/Fase 2/Evidencias Proyecto/Evidencias de documentación/Diseño/Metodología - Pila del producto e incrementos.docx
+++ b/Fase 2/Evidencias Proyecto/Evidencias de documentación/Diseño/Metodología - Pila del producto e incrementos.docx
@@ -288,7 +288,7 @@
           <w:lang w:val="es-ES"/>
         </w:rPr>
       </w:pPr>
-      <w:bookmarkStart w:id="0" w:name="_Toc244090559"/>
+      <w:bookmarkStart w:id="0" w:name="_Toc244092040"/>
       <w:r>
         <w:rPr>
           <w:rFonts w:eastAsia="Times New Roman"/>
@@ -358,7 +358,7 @@
         <w:rPr>
           <w:noProof/>
         </w:rPr>
-        <w:instrText xml:space="preserve"> PAGEREF _Toc244090559 \h </w:instrText>
+        <w:instrText xml:space="preserve"> PAGEREF _Toc244092040 \h </w:instrText>
       </w:r>
       <w:r>
         <w:rPr>
@@ -422,7 +422,7 @@
         <w:rPr>
           <w:noProof/>
         </w:rPr>
-        <w:instrText xml:space="preserve"> PAGEREF _Toc244090560 \h </w:instrText>
+        <w:instrText xml:space="preserve"> PAGEREF _Toc244092041 \h </w:instrText>
       </w:r>
       <w:r>
         <w:rPr>
@@ -486,7 +486,7 @@
         <w:rPr>
           <w:noProof/>
         </w:rPr>
-        <w:instrText xml:space="preserve"> PAGEREF _Toc244090561 \h </w:instrText>
+        <w:instrText xml:space="preserve"> PAGEREF _Toc244092042 \h </w:instrText>
       </w:r>
       <w:r>
         <w:rPr>
@@ -550,7 +550,7 @@
         <w:rPr>
           <w:noProof/>
         </w:rPr>
-        <w:instrText xml:space="preserve"> PAGEREF _Toc244090562 \h </w:instrText>
+        <w:instrText xml:space="preserve"> PAGEREF _Toc244092043 \h </w:instrText>
       </w:r>
       <w:r>
         <w:rPr>
@@ -614,7 +614,7 @@
         <w:rPr>
           <w:noProof/>
         </w:rPr>
-        <w:instrText xml:space="preserve"> PAGEREF _Toc244090563 \h </w:instrText>
+        <w:instrText xml:space="preserve"> PAGEREF _Toc244092044 \h </w:instrText>
       </w:r>
       <w:r>
         <w:rPr>
@@ -678,7 +678,7 @@
         <w:rPr>
           <w:noProof/>
         </w:rPr>
-        <w:instrText xml:space="preserve"> PAGEREF _Toc244090564 \h </w:instrText>
+        <w:instrText xml:space="preserve"> PAGEREF _Toc244092045 \h </w:instrText>
       </w:r>
       <w:r>
         <w:rPr>
@@ -742,7 +742,7 @@
         <w:rPr>
           <w:noProof/>
         </w:rPr>
-        <w:instrText xml:space="preserve"> PAGEREF _Toc244090565 \h </w:instrText>
+        <w:instrText xml:space="preserve"> PAGEREF _Toc244092046 \h </w:instrText>
       </w:r>
       <w:r>
         <w:rPr>
@@ -806,7 +806,7 @@
         <w:rPr>
           <w:noProof/>
         </w:rPr>
-        <w:instrText xml:space="preserve"> PAGEREF _Toc244090566 \h </w:instrText>
+        <w:instrText xml:space="preserve"> PAGEREF _Toc244092047 \h </w:instrText>
       </w:r>
       <w:r>
         <w:rPr>
@@ -870,7 +870,7 @@
         <w:rPr>
           <w:noProof/>
         </w:rPr>
-        <w:instrText xml:space="preserve"> PAGEREF _Toc244090567 \h </w:instrText>
+        <w:instrText xml:space="preserve"> PAGEREF _Toc244092048 \h </w:instrText>
       </w:r>
       <w:r>
         <w:rPr>
@@ -934,7 +934,7 @@
         <w:rPr>
           <w:noProof/>
         </w:rPr>
-        <w:instrText xml:space="preserve"> PAGEREF _Toc244090568 \h </w:instrText>
+        <w:instrText xml:space="preserve"> PAGEREF _Toc244092049 \h </w:instrText>
       </w:r>
       <w:r>
         <w:rPr>
@@ -998,7 +998,7 @@
         <w:rPr>
           <w:noProof/>
         </w:rPr>
-        <w:instrText xml:space="preserve"> PAGEREF _Toc244090569 \h </w:instrText>
+        <w:instrText xml:space="preserve"> PAGEREF _Toc244092050 \h </w:instrText>
       </w:r>
       <w:r>
         <w:rPr>
@@ -1062,7 +1062,7 @@
         <w:rPr>
           <w:noProof/>
         </w:rPr>
-        <w:instrText xml:space="preserve"> PAGEREF _Toc244090570 \h </w:instrText>
+        <w:instrText xml:space="preserve"> PAGEREF _Toc244092051 \h </w:instrText>
       </w:r>
       <w:r>
         <w:rPr>
@@ -1126,7 +1126,7 @@
         <w:rPr>
           <w:noProof/>
         </w:rPr>
-        <w:instrText xml:space="preserve"> PAGEREF _Toc244090571 \h </w:instrText>
+        <w:instrText xml:space="preserve"> PAGEREF _Toc244092052 \h </w:instrText>
       </w:r>
       <w:r>
         <w:rPr>
@@ -1190,7 +1190,7 @@
         <w:rPr>
           <w:noProof/>
         </w:rPr>
-        <w:instrText xml:space="preserve"> PAGEREF _Toc244090572 \h </w:instrText>
+        <w:instrText xml:space="preserve"> PAGEREF _Toc244092053 \h </w:instrText>
       </w:r>
       <w:r>
         <w:rPr>
@@ -1250,7 +1250,7 @@
         </w:rPr>
         <w:br w:type="page"/>
       </w:r>
-      <w:bookmarkStart w:id="1" w:name="_Toc244090560"/>
+      <w:bookmarkStart w:id="1" w:name="_Toc244092041"/>
       <w:r>
         <w:rPr>
           <w:rFonts w:eastAsia="Times New Roman"/>
@@ -1312,7 +1312,6 @@
     <w:tbl>
       <w:tblPr>
         <w:tblW w:w="9406" w:type="dxa"/>
-        <w:tblInd w:w="-8" w:type="dxa"/>
         <w:tblLayout w:type="fixed"/>
         <w:tblCellMar>
           <w:top w:w="15" w:type="dxa"/>
@@ -1917,7 +1916,7 @@
           <w:lang w:val="es-ES"/>
         </w:rPr>
       </w:pPr>
-      <w:bookmarkStart w:id="2" w:name="_Toc244090561"/>
+      <w:bookmarkStart w:id="2" w:name="_Toc244092042"/>
       <w:r>
         <w:rPr>
           <w:rFonts w:eastAsia="Times New Roman"/>
@@ -2046,7 +2045,7 @@
           <w:lang w:val="es-ES"/>
         </w:rPr>
       </w:pPr>
-      <w:bookmarkStart w:id="3" w:name="_Toc244090562"/>
+      <w:bookmarkStart w:id="3" w:name="_Toc244092043"/>
       <w:r>
         <w:rPr>
           <w:rFonts w:eastAsia="Times New Roman"/>
@@ -2075,7 +2074,6 @@
     <w:tbl>
       <w:tblPr>
         <w:tblW w:w="9406" w:type="dxa"/>
-        <w:tblInd w:w="-8" w:type="dxa"/>
         <w:tblLayout w:type="fixed"/>
         <w:tblCellMar>
           <w:top w:w="15" w:type="dxa"/>
@@ -7478,7 +7476,7 @@
           <w:lang w:val="es-ES"/>
         </w:rPr>
       </w:pPr>
-      <w:bookmarkStart w:id="4" w:name="_Toc244090563"/>
+      <w:bookmarkStart w:id="4" w:name="_Toc244092044"/>
       <w:r>
         <w:rPr>
           <w:rFonts w:eastAsia="Times New Roman"/>
@@ -7496,7 +7494,7 @@
           <w:lang w:val="es-ES"/>
         </w:rPr>
       </w:pPr>
-      <w:bookmarkStart w:id="5" w:name="_Toc244090564"/>
+      <w:bookmarkStart w:id="5" w:name="_Toc244092045"/>
       <w:r>
         <w:rPr>
           <w:rFonts w:eastAsia="Times New Roman"/>
@@ -7525,7 +7523,6 @@
     <w:tbl>
       <w:tblPr>
         <w:tblW w:w="9406" w:type="dxa"/>
-        <w:tblInd w:w="-8" w:type="dxa"/>
         <w:tblLayout w:type="fixed"/>
         <w:tblCellMar>
           <w:top w:w="15" w:type="dxa"/>
@@ -8130,7 +8127,7 @@
           <w:lang w:val="es-ES"/>
         </w:rPr>
       </w:pPr>
-      <w:bookmarkStart w:id="6" w:name="_Toc244090565"/>
+      <w:bookmarkStart w:id="6" w:name="_Toc244092046"/>
       <w:r>
         <w:rPr>
           <w:rFonts w:eastAsia="Times New Roman"/>
@@ -8765,7 +8762,7 @@
           <w:lang w:val="es-ES"/>
         </w:rPr>
       </w:pPr>
-      <w:bookmarkStart w:id="7" w:name="_Toc244090566"/>
+      <w:bookmarkStart w:id="7" w:name="_Toc244092047"/>
       <w:r>
         <w:rPr>
           <w:rFonts w:eastAsia="Times New Roman"/>
@@ -9937,7 +9934,7 @@
           <w:lang w:val="es-ES"/>
         </w:rPr>
       </w:pPr>
-      <w:bookmarkStart w:id="8" w:name="_Toc244090567"/>
+      <w:bookmarkStart w:id="8" w:name="_Toc244092048"/>
       <w:r>
         <w:rPr>
           <w:rFonts w:eastAsia="Times New Roman"/>
@@ -10346,7 +10343,7 @@
           <w:lang w:val="es-ES"/>
         </w:rPr>
       </w:pPr>
-      <w:bookmarkStart w:id="9" w:name="_Toc244090568"/>
+      <w:bookmarkStart w:id="9" w:name="_Toc244092049"/>
       <w:r>
         <w:rPr>
           <w:rFonts w:eastAsia="Times New Roman"/>
@@ -10369,24 +10366,7 @@
           <w:szCs w:val="22"/>
           <w:lang w:val="es-ES"/>
         </w:rPr>
-        <w:t xml:space="preserve">Armadas con los diarios de reflexión 2.1, el Informe de avance y la Guía 2.4. Deben confirmarse con el equipo </w:t>
-      </w:r>
-      <w:r>
-        <w:rPr>
-          <w:b/>
-          <w:bCs/>
-          <w:color w:val="9A3412"/>
-          <w:szCs w:val="22"/>
-          <w:lang w:val="es-ES"/>
-        </w:rPr>
-        <w:t>[confirmar]</w:t>
-      </w:r>
-      <w:r>
-        <w:rPr>
-          <w:szCs w:val="22"/>
-          <w:lang w:val="es-ES"/>
-        </w:rPr>
-        <w:t>.</w:t>
+        <w:t>Armadas con los diarios de reflexión 2.1, el Informe de avance y la Guía 2.4. El equipo las confirmó el 28-10-2026.</w:t>
       </w:r>
     </w:p>
     <w:p>
@@ -10398,7 +10378,7 @@
           <w:lang w:val="es-ES"/>
         </w:rPr>
       </w:pPr>
-      <w:bookmarkStart w:id="10" w:name="_Toc244090569"/>
+      <w:bookmarkStart w:id="10" w:name="_Toc244092050"/>
       <w:r>
         <w:rPr>
           <w:rFonts w:eastAsia="Times New Roman"/>
@@ -10711,7 +10691,7 @@
           <w:lang w:val="es-ES"/>
         </w:rPr>
       </w:pPr>
-      <w:bookmarkStart w:id="11" w:name="_Toc244090570"/>
+      <w:bookmarkStart w:id="11" w:name="_Toc244092051"/>
       <w:r>
         <w:rPr>
           <w:rFonts w:eastAsia="Times New Roman"/>
@@ -11090,7 +11070,7 @@
           <w:lang w:val="es-ES"/>
         </w:rPr>
       </w:pPr>
-      <w:bookmarkStart w:id="12" w:name="_Toc244090571"/>
+      <w:bookmarkStart w:id="12" w:name="_Toc244092052"/>
       <w:r>
         <w:rPr>
           <w:rFonts w:eastAsia="Times New Roman"/>
@@ -11709,7 +11689,7 @@
           <w:lang w:val="es-ES"/>
         </w:rPr>
       </w:pPr>
-      <w:bookmarkStart w:id="13" w:name="_Toc244090572"/>
+      <w:bookmarkStart w:id="13" w:name="_Toc244092053"/>
       <w:r>
         <w:rPr>
           <w:rFonts w:eastAsia="Times New Roman"/>
@@ -11735,10 +11715,10 @@
           <w:lang w:val="es-ES"/>
         </w:rPr>
         <w:drawing>
-          <wp:inline distT="0" distB="0" distL="0" distR="0" wp14:anchorId="083CF1F4" wp14:editId="22C16747">
+          <wp:inline distT="0" distB="0" distL="0" distR="0" wp14:anchorId="3166FF1F" wp14:editId="4864D06D">
             <wp:extent cx="5905500" cy="3957300"/>
             <wp:effectExtent l="0" t="0" r="0" b="5715"/>
-            <wp:docPr id="1197148931" name="Imagen 1"/>
+            <wp:docPr id="472874696" name="Imagen 1"/>
             <wp:cNvGraphicFramePr>
               <a:graphicFrameLocks xmlns:a="http://schemas.openxmlformats.org/drawingml/2006/main" noChangeAspect="1"/>
             </wp:cNvGraphicFramePr>
@@ -11746,7 +11726,7 @@
               <a:graphicData uri="http://schemas.openxmlformats.org/drawingml/2006/picture">
                 <pic:pic xmlns:pic="http://schemas.openxmlformats.org/drawingml/2006/picture">
                   <pic:nvPicPr>
-                    <pic:cNvPr id="1197148931" name=""/>
+                    <pic:cNvPr id="472874696" name=""/>
                     <pic:cNvPicPr/>
                   </pic:nvPicPr>
                   <pic:blipFill>
@@ -12572,9 +12552,9 @@
 <file path=word/numbering.xml><?xml version="1.0" encoding="utf-8"?>
 <w:numbering xmlns:wpc="http://schemas.microsoft.com/office/word/2010/wordprocessingCanvas" xmlns:cx="http://schemas.microsoft.com/office/drawing/2014/chartex" xmlns:cx1="http://schemas.microsoft.com/office/drawing/2015/9/8/chartex" xmlns:cx2="http://schemas.microsoft.com/office/drawing/2015/10/21/chartex" xmlns:cx3="http://schemas.microsoft.com/office/drawing/2016/5/9/chartex" xmlns:cx4="http://schemas.microsoft.com/office/drawing/2016/5/10/chartex" xmlns:cx5="http://schemas.microsoft.com/office/drawing/2016/5/11/chartex" xmlns:cx6="http://schemas.microsoft.com/office/drawing/2016/5/12/chartex" xmlns:cx7="http://schemas.microsoft.com/office/drawing/2016/5/13/chartex" xmlns:cx8="http://schemas.microsoft.com/office/drawing/2016/5/14/chartex" xmlns:mc="http://schemas.openxmlformats.org/markup-compatibility/2006" xmlns:aink="http://schemas.microsoft.com/office/drawing/2016/ink" xmlns:am3d="http://schemas.microsoft.com/office/drawing/2017/model3d" xmlns:o="urn:schemas-microsoft-com:office:office" xmlns:oel="http://schemas.microsoft.com/office/2019/extlst" xmlns:r="http://schemas.openxmlformats.org/officeDocument/2006/relationships" xmlns:m="http://schemas.openxmlformats.org/officeDocument/2006/math" xmlns:v="urn:schemas-microsoft-com:vml" xmlns:wp14="http://schemas.microsoft.com/office/word/2010/wordprocessingDrawing" xmlns:wp="http://schemas.openxmlformats.org/drawingml/2006/wordprocessingDrawing" xmlns:w10="urn:schemas-microsoft-com:office:word" xmlns:w="http://schemas.openxmlformats.org/wordprocessingml/2006/main" xmlns:w14="http://schemas.microsoft.com/office/word/2010/wordml" xmlns:w15="http://schemas.microsoft.com/office/word/2012/wordml" xmlns:w16cex="http://schemas.microsoft.com/office/word/2018/wordml/cex" xmlns:w16cid="http://schemas.microsoft.com/office/word/2016/wordml/cid" xmlns:w16="http://schemas.microsoft.com/office/word/2018/wordml" xmlns:w16du="http://schemas.microsoft.com/office/word/2023/wordml/word16du" xmlns:w16sdtdh="http://schemas.microsoft.com/office/word/2020/wordml/sdtdatahash" xmlns:w16sdtfl="http://schemas.microsoft.com/office/word/2024/wordml/sdtformatlock" xmlns:w16se="http://schemas.microsoft.com/office/word/2015/wordml/symex" xmlns:wpg="http://schemas.microsoft.com/office/word/2010/wordprocessingGroup" xmlns:wpi="http://schemas.microsoft.com/office/word/2010/wordprocessingInk" xmlns:wne="http://schemas.microsoft.com/office/word/2006/wordml" xmlns:wps="http://schemas.microsoft.com/office/word/2010/wordprocessingShape" mc:Ignorable="w14 w15 w16se w16cid w16 w16cex w16sdtdh w16sdtfl w16du wp14">
   <w:abstractNum w:abstractNumId="0" w15:restartNumberingAfterBreak="0">
-    <w:nsid w:val="270D6216"/>
+    <w:nsid w:val="02040A76"/>
     <w:multiLevelType w:val="multilevel"/>
-    <w:tmpl w:val="5F885E58"/>
+    <w:tmpl w:val="113C6A58"/>
     <w:lvl w:ilvl="0">
       <w:start w:val="1"/>
       <w:numFmt w:val="bullet"/>
@@ -12721,9 +12701,9 @@
     </w:lvl>
   </w:abstractNum>
   <w:abstractNum w:abstractNumId="1" w15:restartNumberingAfterBreak="0">
-    <w:nsid w:val="39E427C6"/>
+    <w:nsid w:val="10606655"/>
     <w:multiLevelType w:val="multilevel"/>
-    <w:tmpl w:val="153A9C88"/>
+    <w:tmpl w:val="4FF6FFCC"/>
     <w:lvl w:ilvl="0">
       <w:start w:val="1"/>
       <w:numFmt w:val="bullet"/>
@@ -12870,9 +12850,9 @@
     </w:lvl>
   </w:abstractNum>
   <w:abstractNum w:abstractNumId="2" w15:restartNumberingAfterBreak="0">
-    <w:nsid w:val="4F01238F"/>
+    <w:nsid w:val="1EF667F6"/>
     <w:multiLevelType w:val="multilevel"/>
-    <w:tmpl w:val="A8EE5450"/>
+    <w:tmpl w:val="4CBC4FC0"/>
     <w:lvl w:ilvl="0">
       <w:start w:val="1"/>
       <w:numFmt w:val="bullet"/>
@@ -13019,9 +12999,9 @@
     </w:lvl>
   </w:abstractNum>
   <w:abstractNum w:abstractNumId="3" w15:restartNumberingAfterBreak="0">
-    <w:nsid w:val="602A6356"/>
+    <w:nsid w:val="306F6135"/>
     <w:multiLevelType w:val="multilevel"/>
-    <w:tmpl w:val="F82093D2"/>
+    <w:tmpl w:val="E006DD48"/>
     <w:lvl w:ilvl="0">
       <w:start w:val="1"/>
       <w:numFmt w:val="bullet"/>
@@ -13168,9 +13148,9 @@
     </w:lvl>
   </w:abstractNum>
   <w:abstractNum w:abstractNumId="4" w15:restartNumberingAfterBreak="0">
-    <w:nsid w:val="69C047DB"/>
+    <w:nsid w:val="468B1311"/>
     <w:multiLevelType w:val="multilevel"/>
-    <w:tmpl w:val="C8C85E54"/>
+    <w:tmpl w:val="341A36B4"/>
     <w:lvl w:ilvl="0">
       <w:start w:val="1"/>
       <w:numFmt w:val="bullet"/>
@@ -13317,9 +13297,9 @@
     </w:lvl>
   </w:abstractNum>
   <w:abstractNum w:abstractNumId="5" w15:restartNumberingAfterBreak="0">
-    <w:nsid w:val="72BC6B57"/>
+    <w:nsid w:val="4B775747"/>
     <w:multiLevelType w:val="multilevel"/>
-    <w:tmpl w:val="9426243A"/>
+    <w:tmpl w:val="0D027FE8"/>
     <w:lvl w:ilvl="0">
       <w:start w:val="1"/>
       <w:numFmt w:val="bullet"/>
@@ -13466,9 +13446,9 @@
     </w:lvl>
   </w:abstractNum>
   <w:abstractNum w:abstractNumId="6" w15:restartNumberingAfterBreak="0">
-    <w:nsid w:val="781B7B26"/>
+    <w:nsid w:val="60961D0B"/>
     <w:multiLevelType w:val="multilevel"/>
-    <w:tmpl w:val="4AC6E912"/>
+    <w:tmpl w:val="D678314A"/>
     <w:lvl w:ilvl="0">
       <w:start w:val="1"/>
       <w:numFmt w:val="bullet"/>
@@ -13614,26 +13594,26 @@
       </w:rPr>
     </w:lvl>
   </w:abstractNum>
-  <w:num w:numId="1" w16cid:durableId="1012493891">
+  <w:num w:numId="1" w16cid:durableId="21244747">
+    <w:abstractNumId w:val="2"/>
+  </w:num>
+  <w:num w:numId="2" w16cid:durableId="2005158614">
+    <w:abstractNumId w:val="1"/>
+  </w:num>
+  <w:num w:numId="3" w16cid:durableId="1446727451">
     <w:abstractNumId w:val="3"/>
   </w:num>
-  <w:num w:numId="2" w16cid:durableId="692418425">
+  <w:num w:numId="4" w16cid:durableId="428357222">
+    <w:abstractNumId w:val="0"/>
+  </w:num>
+  <w:num w:numId="5" w16cid:durableId="161435961">
+    <w:abstractNumId w:val="4"/>
+  </w:num>
+  <w:num w:numId="6" w16cid:durableId="987782445">
     <w:abstractNumId w:val="5"/>
   </w:num>
-  <w:num w:numId="3" w16cid:durableId="1549413297">
-    <w:abstractNumId w:val="0"/>
-  </w:num>
-  <w:num w:numId="4" w16cid:durableId="613486318">
-    <w:abstractNumId w:val="4"/>
-  </w:num>
-  <w:num w:numId="5" w16cid:durableId="1991054965">
+  <w:num w:numId="7" w16cid:durableId="672339544">
     <w:abstractNumId w:val="6"/>
-  </w:num>
-  <w:num w:numId="6" w16cid:durableId="1067219354">
-    <w:abstractNumId w:val="1"/>
-  </w:num>
-  <w:num w:numId="7" w16cid:durableId="80489948">
-    <w:abstractNumId w:val="2"/>
   </w:num>
 </w:numbering>
 </file>
@@ -14087,7 +14067,7 @@
     <w:semiHidden/>
     <w:unhideWhenUsed/>
     <w:qFormat/>
-    <w:rsid w:val="00517A92"/>
+    <w:rsid w:val="00AF50DF"/>
     <w:pPr>
       <w:keepNext/>
       <w:keepLines/>
@@ -14212,7 +14192,7 @@
     <w:link w:val="Ttulo3"/>
     <w:uiPriority w:val="9"/>
     <w:semiHidden/>
-    <w:rsid w:val="00517A92"/>
+    <w:rsid w:val="00AF50DF"/>
     <w:rPr>
       <w:rFonts w:ascii="Arial" w:eastAsiaTheme="majorEastAsia" w:hAnsi="Arial" w:cs="Arial"/>
       <w:b/>
@@ -14228,7 +14208,7 @@
     <w:autoRedefine/>
     <w:uiPriority w:val="39"/>
     <w:unhideWhenUsed/>
-    <w:rsid w:val="00517A92"/>
+    <w:rsid w:val="00AF50DF"/>
     <w:pPr>
       <w:spacing w:after="100"/>
     </w:pPr>
@@ -14240,7 +14220,7 @@
     <w:autoRedefine/>
     <w:uiPriority w:val="39"/>
     <w:unhideWhenUsed/>
-    <w:rsid w:val="00517A92"/>
+    <w:rsid w:val="00AF50DF"/>
     <w:pPr>
       <w:spacing w:after="100"/>
       <w:ind w:left="220"/>
@@ -14252,7 +14232,7 @@
     <w:link w:val="EncabezadoCar"/>
     <w:uiPriority w:val="99"/>
     <w:unhideWhenUsed/>
-    <w:rsid w:val="00517A92"/>
+    <w:rsid w:val="00AF50DF"/>
     <w:pPr>
       <w:tabs>
         <w:tab w:val="center" w:pos="4419"/>
@@ -14266,7 +14246,7 @@
     <w:basedOn w:val="Fuentedeprrafopredeter"/>
     <w:link w:val="Encabezado"/>
     <w:uiPriority w:val="99"/>
-    <w:rsid w:val="00517A92"/>
+    <w:rsid w:val="00AF50DF"/>
     <w:rPr>
       <w:rFonts w:ascii="Arial" w:eastAsiaTheme="minorEastAsia" w:hAnsi="Arial" w:cs="Arial"/>
       <w:sz w:val="22"/>
@@ -14279,7 +14259,7 @@
     <w:link w:val="PiedepginaCar"/>
     <w:uiPriority w:val="99"/>
     <w:unhideWhenUsed/>
-    <w:rsid w:val="00517A92"/>
+    <w:rsid w:val="00AF50DF"/>
     <w:pPr>
       <w:tabs>
         <w:tab w:val="center" w:pos="4419"/>
@@ -14293,7 +14273,7 @@
     <w:basedOn w:val="Fuentedeprrafopredeter"/>
     <w:link w:val="Piedepgina"/>
     <w:uiPriority w:val="99"/>
-    <w:rsid w:val="00517A92"/>
+    <w:rsid w:val="00AF50DF"/>
     <w:rPr>
       <w:rFonts w:ascii="Arial" w:eastAsiaTheme="minorEastAsia" w:hAnsi="Arial" w:cs="Arial"/>
       <w:sz w:val="22"/>
@@ -14306,7 +14286,7 @@
     <w:uiPriority w:val="99"/>
     <w:semiHidden/>
     <w:unhideWhenUsed/>
-    <w:rsid w:val="00517A92"/>
+    <w:rsid w:val="00AF50DF"/>
   </w:style>
 </w:styles>
 </file>

</xml_diff>